<commit_message>
Fill placeholders in method statement using available drawing data
Co-Authored-By: Claude Sonnet 5.5 <noreply@anthropic.com>
Claude-Session: https://claude.ai/code/session_01GDGPVAovqG22ES5QmV4aPm
</commit_message>
<xml_diff>
--- a/Metode_Pelaksanaan_BPVP_Morowali_Utara.docx
+++ b/Metode_Pelaksanaan_BPVP_Morowali_Utara.docx
@@ -526,7 +526,7 @@
                 <w:sz w:val="18"/>
                 <w:szCs w:val="18"/>
               </w:rPr>
-              <w:t xml:space="preserve">[ ........................................ ]</w:t>
+              <w:t xml:space="preserve">Penyedia jasa pelaksana pekerjaan (sesuai kontrak)</w:t>
             </w:r>
           </w:p>
         </w:tc>
@@ -545,7 +545,7 @@
           <w:sz w:val="18"/>
           <w:szCs w:val="18"/>
         </w:rPr>
-        <w:t xml:space="preserve">Dokumen ini disusun berdasarkan Gambar Reviu Desain (50 lembar). Data bertanda [ ... ] wajib dilengkapi Kontraktor.</w:t>
+        <w:t xml:space="preserve">Dokumen ini disusun berdasarkan Gambar Reviu Desain (50 lembar) dan asumsi teknis yang dinyatakan pada masing-masing bab.</w:t>
       </w:r>
     </w:p>
     <w:p>
@@ -1977,7 +1977,7 @@
                 <w:sz w:val="18"/>
                 <w:szCs w:val="18"/>
               </w:rPr>
-              <w:t xml:space="preserve">[ ... ] hari kalender (jadwal indikatif pada Bab 9 diasumsikan 9 bulan)</w:t>
+              <w:t xml:space="preserve">270 hari kalender (asumsi perencanaan jadwal; sesuaikan dengan kontrak)</w:t>
             </w:r>
           </w:p>
         </w:tc>
@@ -10129,7 +10129,7 @@
           <w:sz w:val="24"/>
           <w:szCs w:val="24"/>
         </w:rPr>
-        <w:t xml:space="preserve">5.6  Rekapitulasi Volume (diisi hasil ukur Kontraktor)</w:t>
+        <w:t xml:space="preserve">5.6  Kuantitas Pekerjaan Tanah dan Turap yang Dapat Diturunkan dari Gambar</w:t>
       </w:r>
     </w:p>
     <w:tbl>
@@ -10145,11 +10145,9 @@
         </w:tblBorders>
       </w:tblPr>
       <w:tblGrid>
-        <w:gridCol w:w="1500"/>
-        <w:gridCol w:w="1900"/>
-        <w:gridCol w:w="1900"/>
-        <w:gridCol w:w="1900"/>
-        <w:gridCol w:w="2438"/>
+        <w:gridCol w:w="2000"/>
+        <w:gridCol w:w="3900"/>
+        <w:gridCol w:w="3738"/>
       </w:tblGrid>
       <w:tr>
         <w:trPr>
@@ -10157,7 +10155,7 @@
         </w:trPr>
         <w:tc>
           <w:tcPr>
-            <w:tcW w:type="dxa" w:w="1500"/>
+            <w:tcW w:type="dxa" w:w="2000"/>
             <w:tcBorders>
               <w:top w:val="single" w:color="808080" w:sz="4"/>
               <w:left w:val="single" w:color="808080" w:sz="4"/>
@@ -10187,13 +10185,13 @@
                 <w:sz w:val="18"/>
                 <w:szCs w:val="18"/>
               </w:rPr>
-              <w:t xml:space="preserve">Zona</w:t>
-            </w:r>
-          </w:p>
-        </w:tc>
-        <w:tc>
-          <w:tcPr>
-            <w:tcW w:type="dxa" w:w="1900"/>
+              <w:t xml:space="preserve">Komponen</w:t>
+            </w:r>
+          </w:p>
+        </w:tc>
+        <w:tc>
+          <w:tcPr>
+            <w:tcW w:type="dxa" w:w="3900"/>
             <w:tcBorders>
               <w:top w:val="single" w:color="808080" w:sz="4"/>
               <w:left w:val="single" w:color="808080" w:sz="4"/>
@@ -10223,13 +10221,13 @@
                 <w:sz w:val="18"/>
                 <w:szCs w:val="18"/>
               </w:rPr>
-              <w:t xml:space="preserve">Galian (m³)</w:t>
-            </w:r>
-          </w:p>
-        </w:tc>
-        <w:tc>
-          <w:tcPr>
-            <w:tcW w:type="dxa" w:w="1900"/>
+              <w:t xml:space="preserve">Data dari gambar</w:t>
+            </w:r>
+          </w:p>
+        </w:tc>
+        <w:tc>
+          <w:tcPr>
+            <w:tcW w:type="dxa" w:w="3738"/>
             <w:tcBorders>
               <w:top w:val="single" w:color="808080" w:sz="4"/>
               <w:left w:val="single" w:color="808080" w:sz="4"/>
@@ -10259,79 +10257,7 @@
                 <w:sz w:val="18"/>
                 <w:szCs w:val="18"/>
               </w:rPr>
-              <w:t xml:space="preserve">Timbunan (m³)</w:t>
-            </w:r>
-          </w:p>
-        </w:tc>
-        <w:tc>
-          <w:tcPr>
-            <w:tcW w:type="dxa" w:w="1900"/>
-            <w:tcBorders>
-              <w:top w:val="single" w:color="808080" w:sz="4"/>
-              <w:left w:val="single" w:color="808080" w:sz="4"/>
-              <w:bottom w:val="single" w:color="808080" w:sz="4"/>
-              <w:right w:val="single" w:color="808080" w:sz="4"/>
-            </w:tcBorders>
-            <w:shd w:fill="1F3864" w:color="auto" w:val="clear"/>
-            <w:tcMar>
-              <w:top w:type="dxa" w:w="50"/>
-              <w:left w:type="dxa" w:w="90"/>
-              <w:bottom w:type="dxa" w:w="50"/>
-              <w:right w:type="dxa" w:w="90"/>
-            </w:tcMar>
-            <w:vAlign w:val="center"/>
-          </w:tcPr>
-          <w:p>
-            <w:pPr>
-              <w:spacing w:after="20"/>
-              <w:jc w:val="center"/>
-            </w:pPr>
-            <w:r>
-              <w:rPr>
-                <w:rFonts w:ascii="Arial" w:cs="Arial" w:eastAsia="Arial" w:hAnsi="Arial"/>
-                <w:b/>
-                <w:bCs/>
-                <w:color w:val="FFFFFF"/>
-                <w:sz w:val="18"/>
-                <w:szCs w:val="18"/>
-              </w:rPr>
-              <w:t xml:space="preserve">Selisih (m³)</w:t>
-            </w:r>
-          </w:p>
-        </w:tc>
-        <w:tc>
-          <w:tcPr>
-            <w:tcW w:type="dxa" w:w="2438"/>
-            <w:tcBorders>
-              <w:top w:val="single" w:color="808080" w:sz="4"/>
-              <w:left w:val="single" w:color="808080" w:sz="4"/>
-              <w:bottom w:val="single" w:color="808080" w:sz="4"/>
-              <w:right w:val="single" w:color="808080" w:sz="4"/>
-            </w:tcBorders>
-            <w:shd w:fill="1F3864" w:color="auto" w:val="clear"/>
-            <w:tcMar>
-              <w:top w:type="dxa" w:w="50"/>
-              <w:left w:type="dxa" w:w="90"/>
-              <w:bottom w:type="dxa" w:w="50"/>
-              <w:right w:type="dxa" w:w="90"/>
-            </w:tcMar>
-            <w:vAlign w:val="center"/>
-          </w:tcPr>
-          <w:p>
-            <w:pPr>
-              <w:spacing w:after="20"/>
-              <w:jc w:val="center"/>
-            </w:pPr>
-            <w:r>
-              <w:rPr>
-                <w:rFonts w:ascii="Arial" w:cs="Arial" w:eastAsia="Arial" w:hAnsi="Arial"/>
-                <w:b/>
-                <w:bCs/>
-                <w:color w:val="FFFFFF"/>
-                <w:sz w:val="18"/>
-                <w:szCs w:val="18"/>
-              </w:rPr>
-              <w:t xml:space="preserve">Keterangan</w:t>
+              <w:t xml:space="preserve">Dasar perhitungan volume</w:t>
             </w:r>
           </w:p>
         </w:tc>
@@ -10342,161 +10268,97 @@
         </w:trPr>
         <w:tc>
           <w:tcPr>
-            <w:tcW w:type="dxa" w:w="1500"/>
-            <w:tcBorders>
-              <w:top w:val="single" w:color="808080" w:sz="4"/>
-              <w:left w:val="single" w:color="808080" w:sz="4"/>
-              <w:bottom w:val="single" w:color="808080" w:sz="4"/>
-              <w:right w:val="single" w:color="808080" w:sz="4"/>
-            </w:tcBorders>
-            <w:tcMar>
-              <w:top w:type="dxa" w:w="50"/>
-              <w:left w:type="dxa" w:w="90"/>
-              <w:bottom w:type="dxa" w:w="50"/>
-              <w:right w:type="dxa" w:w="90"/>
-            </w:tcMar>
-            <w:vAlign w:val="center"/>
-          </w:tcPr>
-          <w:p>
-            <w:pPr>
-              <w:spacing w:after="20"/>
-              <w:jc w:val="center"/>
-            </w:pPr>
-            <w:r>
-              <w:rPr>
-                <w:rFonts w:ascii="Arial" w:cs="Arial" w:eastAsia="Arial" w:hAnsi="Arial"/>
-                <w:sz w:val="18"/>
-                <w:szCs w:val="18"/>
-              </w:rPr>
-              <w:t xml:space="preserve">I</w:t>
-            </w:r>
-          </w:p>
-        </w:tc>
-        <w:tc>
-          <w:tcPr>
-            <w:tcW w:type="dxa" w:w="1900"/>
-            <w:tcBorders>
-              <w:top w:val="single" w:color="808080" w:sz="4"/>
-              <w:left w:val="single" w:color="808080" w:sz="4"/>
-              <w:bottom w:val="single" w:color="808080" w:sz="4"/>
-              <w:right w:val="single" w:color="808080" w:sz="4"/>
-            </w:tcBorders>
-            <w:tcMar>
-              <w:top w:type="dxa" w:w="50"/>
-              <w:left w:type="dxa" w:w="90"/>
-              <w:bottom w:type="dxa" w:w="50"/>
-              <w:right w:type="dxa" w:w="90"/>
-            </w:tcMar>
-            <w:vAlign w:val="center"/>
-          </w:tcPr>
-          <w:p>
-            <w:pPr>
-              <w:spacing w:after="20"/>
-              <w:jc w:val="center"/>
-            </w:pPr>
-            <w:r>
-              <w:rPr>
-                <w:rFonts w:ascii="Arial" w:cs="Arial" w:eastAsia="Arial" w:hAnsi="Arial"/>
-                <w:sz w:val="18"/>
-                <w:szCs w:val="18"/>
-              </w:rPr>
-              <w:t xml:space="preserve">[ ... ]</w:t>
-            </w:r>
-          </w:p>
-        </w:tc>
-        <w:tc>
-          <w:tcPr>
-            <w:tcW w:type="dxa" w:w="1900"/>
-            <w:tcBorders>
-              <w:top w:val="single" w:color="808080" w:sz="4"/>
-              <w:left w:val="single" w:color="808080" w:sz="4"/>
-              <w:bottom w:val="single" w:color="808080" w:sz="4"/>
-              <w:right w:val="single" w:color="808080" w:sz="4"/>
-            </w:tcBorders>
-            <w:tcMar>
-              <w:top w:type="dxa" w:w="50"/>
-              <w:left w:type="dxa" w:w="90"/>
-              <w:bottom w:type="dxa" w:w="50"/>
-              <w:right w:type="dxa" w:w="90"/>
-            </w:tcMar>
-            <w:vAlign w:val="center"/>
-          </w:tcPr>
-          <w:p>
-            <w:pPr>
-              <w:spacing w:after="20"/>
-              <w:jc w:val="center"/>
-            </w:pPr>
-            <w:r>
-              <w:rPr>
-                <w:rFonts w:ascii="Arial" w:cs="Arial" w:eastAsia="Arial" w:hAnsi="Arial"/>
-                <w:sz w:val="18"/>
-                <w:szCs w:val="18"/>
-              </w:rPr>
-              <w:t xml:space="preserve">[ ... ]</w:t>
-            </w:r>
-          </w:p>
-        </w:tc>
-        <w:tc>
-          <w:tcPr>
-            <w:tcW w:type="dxa" w:w="1900"/>
-            <w:tcBorders>
-              <w:top w:val="single" w:color="808080" w:sz="4"/>
-              <w:left w:val="single" w:color="808080" w:sz="4"/>
-              <w:bottom w:val="single" w:color="808080" w:sz="4"/>
-              <w:right w:val="single" w:color="808080" w:sz="4"/>
-            </w:tcBorders>
-            <w:tcMar>
-              <w:top w:type="dxa" w:w="50"/>
-              <w:left w:type="dxa" w:w="90"/>
-              <w:bottom w:type="dxa" w:w="50"/>
-              <w:right w:type="dxa" w:w="90"/>
-            </w:tcMar>
-            <w:vAlign w:val="center"/>
-          </w:tcPr>
-          <w:p>
-            <w:pPr>
-              <w:spacing w:after="20"/>
-              <w:jc w:val="center"/>
-            </w:pPr>
-            <w:r>
-              <w:rPr>
-                <w:rFonts w:ascii="Arial" w:cs="Arial" w:eastAsia="Arial" w:hAnsi="Arial"/>
-                <w:sz w:val="18"/>
-                <w:szCs w:val="18"/>
-              </w:rPr>
-              <w:t xml:space="preserve">[ ... ]</w:t>
-            </w:r>
-          </w:p>
-        </w:tc>
-        <w:tc>
-          <w:tcPr>
-            <w:tcW w:type="dxa" w:w="2438"/>
-            <w:tcBorders>
-              <w:top w:val="single" w:color="808080" w:sz="4"/>
-              <w:left w:val="single" w:color="808080" w:sz="4"/>
-              <w:bottom w:val="single" w:color="808080" w:sz="4"/>
-              <w:right w:val="single" w:color="808080" w:sz="4"/>
-            </w:tcBorders>
-            <w:tcMar>
-              <w:top w:type="dxa" w:w="50"/>
-              <w:left w:type="dxa" w:w="90"/>
-              <w:bottom w:type="dxa" w:w="50"/>
-              <w:right w:type="dxa" w:w="90"/>
-            </w:tcMar>
-            <w:vAlign w:val="center"/>
-          </w:tcPr>
-          <w:p>
-            <w:pPr>
-              <w:spacing w:after="20"/>
-              <w:jc w:val="left"/>
-            </w:pPr>
-            <w:r>
-              <w:rPr>
-                <w:rFonts w:ascii="Arial" w:cs="Arial" w:eastAsia="Arial" w:hAnsi="Arial"/>
-                <w:sz w:val="18"/>
-                <w:szCs w:val="18"/>
-              </w:rPr>
-              <w:t xml:space="preserve"/>
+            <w:tcW w:type="dxa" w:w="2000"/>
+            <w:tcBorders>
+              <w:top w:val="single" w:color="808080" w:sz="4"/>
+              <w:left w:val="single" w:color="808080" w:sz="4"/>
+              <w:bottom w:val="single" w:color="808080" w:sz="4"/>
+              <w:right w:val="single" w:color="808080" w:sz="4"/>
+            </w:tcBorders>
+            <w:tcMar>
+              <w:top w:type="dxa" w:w="50"/>
+              <w:left w:type="dxa" w:w="90"/>
+              <w:bottom w:type="dxa" w:w="50"/>
+              <w:right w:type="dxa" w:w="90"/>
+            </w:tcMar>
+            <w:vAlign w:val="center"/>
+          </w:tcPr>
+          <w:p>
+            <w:pPr>
+              <w:spacing w:after="20"/>
+              <w:jc w:val="left"/>
+            </w:pPr>
+            <w:r>
+              <w:rPr>
+                <w:rFonts w:ascii="Arial" w:cs="Arial" w:eastAsia="Arial" w:hAnsi="Arial"/>
+                <w:sz w:val="18"/>
+                <w:szCs w:val="18"/>
+              </w:rPr>
+              <w:t xml:space="preserve">Teras pematangan</w:t>
+            </w:r>
+          </w:p>
+        </w:tc>
+        <w:tc>
+          <w:tcPr>
+            <w:tcW w:type="dxa" w:w="3900"/>
+            <w:tcBorders>
+              <w:top w:val="single" w:color="808080" w:sz="4"/>
+              <w:left w:val="single" w:color="808080" w:sz="4"/>
+              <w:bottom w:val="single" w:color="808080" w:sz="4"/>
+              <w:right w:val="single" w:color="808080" w:sz="4"/>
+            </w:tcBorders>
+            <w:tcMar>
+              <w:top w:type="dxa" w:w="50"/>
+              <w:left w:type="dxa" w:w="90"/>
+              <w:bottom w:type="dxa" w:w="50"/>
+              <w:right w:type="dxa" w:w="90"/>
+            </w:tcMar>
+            <w:vAlign w:val="center"/>
+          </w:tcPr>
+          <w:p>
+            <w:pPr>
+              <w:spacing w:after="20"/>
+              <w:jc w:val="left"/>
+            </w:pPr>
+            <w:r>
+              <w:rPr>
+                <w:rFonts w:ascii="Arial" w:cs="Arial" w:eastAsia="Arial" w:hAnsi="Arial"/>
+                <w:sz w:val="18"/>
+                <w:szCs w:val="18"/>
+              </w:rPr>
+              <w:t xml:space="preserve">Teras bertingkat ±13 s.d. ±49 mdpl (A1-18); dimensi tapak ±504 m × ±209–281 m (satuan cm pada gambar pematangan)</w:t>
+            </w:r>
+          </w:p>
+        </w:tc>
+        <w:tc>
+          <w:tcPr>
+            <w:tcW w:type="dxa" w:w="3738"/>
+            <w:tcBorders>
+              <w:top w:val="single" w:color="808080" w:sz="4"/>
+              <w:left w:val="single" w:color="808080" w:sz="4"/>
+              <w:bottom w:val="single" w:color="808080" w:sz="4"/>
+              <w:right w:val="single" w:color="808080" w:sz="4"/>
+            </w:tcBorders>
+            <w:tcMar>
+              <w:top w:type="dxa" w:w="50"/>
+              <w:left w:type="dxa" w:w="90"/>
+              <w:bottom w:type="dxa" w:w="50"/>
+              <w:right w:type="dxa" w:w="90"/>
+            </w:tcMar>
+            <w:vAlign w:val="center"/>
+          </w:tcPr>
+          <w:p>
+            <w:pPr>
+              <w:spacing w:after="20"/>
+              <w:jc w:val="left"/>
+            </w:pPr>
+            <w:r>
+              <w:rPr>
+                <w:rFonts w:ascii="Arial" w:cs="Arial" w:eastAsia="Arial" w:hAnsi="Arial"/>
+                <w:sz w:val="18"/>
+                <w:szCs w:val="18"/>
+              </w:rPr>
+              <w:t xml:space="preserve">Metode luas penampang rata-rata (average end area) dari POT.1–POT.10 + potongan tambahan per 25 m</w:t>
             </w:r>
           </w:p>
         </w:tc>
@@ -10507,161 +10369,97 @@
         </w:trPr>
         <w:tc>
           <w:tcPr>
-            <w:tcW w:type="dxa" w:w="1500"/>
-            <w:tcBorders>
-              <w:top w:val="single" w:color="808080" w:sz="4"/>
-              <w:left w:val="single" w:color="808080" w:sz="4"/>
-              <w:bottom w:val="single" w:color="808080" w:sz="4"/>
-              <w:right w:val="single" w:color="808080" w:sz="4"/>
-            </w:tcBorders>
-            <w:tcMar>
-              <w:top w:type="dxa" w:w="50"/>
-              <w:left w:type="dxa" w:w="90"/>
-              <w:bottom w:type="dxa" w:w="50"/>
-              <w:right w:type="dxa" w:w="90"/>
-            </w:tcMar>
-            <w:vAlign w:val="center"/>
-          </w:tcPr>
-          <w:p>
-            <w:pPr>
-              <w:spacing w:after="20"/>
-              <w:jc w:val="center"/>
-            </w:pPr>
-            <w:r>
-              <w:rPr>
-                <w:rFonts w:ascii="Arial" w:cs="Arial" w:eastAsia="Arial" w:hAnsi="Arial"/>
-                <w:sz w:val="18"/>
-                <w:szCs w:val="18"/>
-              </w:rPr>
-              <w:t xml:space="preserve">II</w:t>
-            </w:r>
-          </w:p>
-        </w:tc>
-        <w:tc>
-          <w:tcPr>
-            <w:tcW w:type="dxa" w:w="1900"/>
-            <w:tcBorders>
-              <w:top w:val="single" w:color="808080" w:sz="4"/>
-              <w:left w:val="single" w:color="808080" w:sz="4"/>
-              <w:bottom w:val="single" w:color="808080" w:sz="4"/>
-              <w:right w:val="single" w:color="808080" w:sz="4"/>
-            </w:tcBorders>
-            <w:tcMar>
-              <w:top w:type="dxa" w:w="50"/>
-              <w:left w:type="dxa" w:w="90"/>
-              <w:bottom w:type="dxa" w:w="50"/>
-              <w:right w:type="dxa" w:w="90"/>
-            </w:tcMar>
-            <w:vAlign w:val="center"/>
-          </w:tcPr>
-          <w:p>
-            <w:pPr>
-              <w:spacing w:after="20"/>
-              <w:jc w:val="center"/>
-            </w:pPr>
-            <w:r>
-              <w:rPr>
-                <w:rFonts w:ascii="Arial" w:cs="Arial" w:eastAsia="Arial" w:hAnsi="Arial"/>
-                <w:sz w:val="18"/>
-                <w:szCs w:val="18"/>
-              </w:rPr>
-              <w:t xml:space="preserve">[ ... ]</w:t>
-            </w:r>
-          </w:p>
-        </w:tc>
-        <w:tc>
-          <w:tcPr>
-            <w:tcW w:type="dxa" w:w="1900"/>
-            <w:tcBorders>
-              <w:top w:val="single" w:color="808080" w:sz="4"/>
-              <w:left w:val="single" w:color="808080" w:sz="4"/>
-              <w:bottom w:val="single" w:color="808080" w:sz="4"/>
-              <w:right w:val="single" w:color="808080" w:sz="4"/>
-            </w:tcBorders>
-            <w:tcMar>
-              <w:top w:type="dxa" w:w="50"/>
-              <w:left w:type="dxa" w:w="90"/>
-              <w:bottom w:type="dxa" w:w="50"/>
-              <w:right w:type="dxa" w:w="90"/>
-            </w:tcMar>
-            <w:vAlign w:val="center"/>
-          </w:tcPr>
-          <w:p>
-            <w:pPr>
-              <w:spacing w:after="20"/>
-              <w:jc w:val="center"/>
-            </w:pPr>
-            <w:r>
-              <w:rPr>
-                <w:rFonts w:ascii="Arial" w:cs="Arial" w:eastAsia="Arial" w:hAnsi="Arial"/>
-                <w:sz w:val="18"/>
-                <w:szCs w:val="18"/>
-              </w:rPr>
-              <w:t xml:space="preserve">[ ... ]</w:t>
-            </w:r>
-          </w:p>
-        </w:tc>
-        <w:tc>
-          <w:tcPr>
-            <w:tcW w:type="dxa" w:w="1900"/>
-            <w:tcBorders>
-              <w:top w:val="single" w:color="808080" w:sz="4"/>
-              <w:left w:val="single" w:color="808080" w:sz="4"/>
-              <w:bottom w:val="single" w:color="808080" w:sz="4"/>
-              <w:right w:val="single" w:color="808080" w:sz="4"/>
-            </w:tcBorders>
-            <w:tcMar>
-              <w:top w:type="dxa" w:w="50"/>
-              <w:left w:type="dxa" w:w="90"/>
-              <w:bottom w:type="dxa" w:w="50"/>
-              <w:right w:type="dxa" w:w="90"/>
-            </w:tcMar>
-            <w:vAlign w:val="center"/>
-          </w:tcPr>
-          <w:p>
-            <w:pPr>
-              <w:spacing w:after="20"/>
-              <w:jc w:val="center"/>
-            </w:pPr>
-            <w:r>
-              <w:rPr>
-                <w:rFonts w:ascii="Arial" w:cs="Arial" w:eastAsia="Arial" w:hAnsi="Arial"/>
-                <w:sz w:val="18"/>
-                <w:szCs w:val="18"/>
-              </w:rPr>
-              <w:t xml:space="preserve">[ ... ]</w:t>
-            </w:r>
-          </w:p>
-        </w:tc>
-        <w:tc>
-          <w:tcPr>
-            <w:tcW w:type="dxa" w:w="2438"/>
-            <w:tcBorders>
-              <w:top w:val="single" w:color="808080" w:sz="4"/>
-              <w:left w:val="single" w:color="808080" w:sz="4"/>
-              <w:bottom w:val="single" w:color="808080" w:sz="4"/>
-              <w:right w:val="single" w:color="808080" w:sz="4"/>
-            </w:tcBorders>
-            <w:tcMar>
-              <w:top w:type="dxa" w:w="50"/>
-              <w:left w:type="dxa" w:w="90"/>
-              <w:bottom w:type="dxa" w:w="50"/>
-              <w:right w:type="dxa" w:w="90"/>
-            </w:tcMar>
-            <w:vAlign w:val="center"/>
-          </w:tcPr>
-          <w:p>
-            <w:pPr>
-              <w:spacing w:after="20"/>
-              <w:jc w:val="left"/>
-            </w:pPr>
-            <w:r>
-              <w:rPr>
-                <w:rFonts w:ascii="Arial" w:cs="Arial" w:eastAsia="Arial" w:hAnsi="Arial"/>
-                <w:sz w:val="18"/>
-                <w:szCs w:val="18"/>
-              </w:rPr>
-              <w:t xml:space="preserve"/>
+            <w:tcW w:type="dxa" w:w="2000"/>
+            <w:tcBorders>
+              <w:top w:val="single" w:color="808080" w:sz="4"/>
+              <w:left w:val="single" w:color="808080" w:sz="4"/>
+              <w:bottom w:val="single" w:color="808080" w:sz="4"/>
+              <w:right w:val="single" w:color="808080" w:sz="4"/>
+            </w:tcBorders>
+            <w:tcMar>
+              <w:top w:type="dxa" w:w="50"/>
+              <w:left w:type="dxa" w:w="90"/>
+              <w:bottom w:type="dxa" w:w="50"/>
+              <w:right w:type="dxa" w:w="90"/>
+            </w:tcMar>
+            <w:vAlign w:val="center"/>
+          </w:tcPr>
+          <w:p>
+            <w:pPr>
+              <w:spacing w:after="20"/>
+              <w:jc w:val="left"/>
+            </w:pPr>
+            <w:r>
+              <w:rPr>
+                <w:rFonts w:ascii="Arial" w:cs="Arial" w:eastAsia="Arial" w:hAnsi="Arial"/>
+                <w:sz w:val="18"/>
+                <w:szCs w:val="18"/>
+              </w:rPr>
+              <w:t xml:space="preserve">Turap Segmen A</w:t>
+            </w:r>
+          </w:p>
+        </w:tc>
+        <w:tc>
+          <w:tcPr>
+            <w:tcW w:type="dxa" w:w="3900"/>
+            <w:tcBorders>
+              <w:top w:val="single" w:color="808080" w:sz="4"/>
+              <w:left w:val="single" w:color="808080" w:sz="4"/>
+              <w:bottom w:val="single" w:color="808080" w:sz="4"/>
+              <w:right w:val="single" w:color="808080" w:sz="4"/>
+            </w:tcBorders>
+            <w:tcMar>
+              <w:top w:type="dxa" w:w="50"/>
+              <w:left w:type="dxa" w:w="90"/>
+              <w:bottom w:type="dxa" w:w="50"/>
+              <w:right w:type="dxa" w:w="90"/>
+            </w:tcMar>
+            <w:vAlign w:val="center"/>
+          </w:tcPr>
+          <w:p>
+            <w:pPr>
+              <w:spacing w:after="20"/>
+              <w:jc w:val="left"/>
+            </w:pPr>
+            <w:r>
+              <w:rPr>
+                <w:rFonts w:ascii="Arial" w:cs="Arial" w:eastAsia="Arial" w:hAnsi="Arial"/>
+                <w:sz w:val="18"/>
+                <w:szCs w:val="18"/>
+              </w:rPr>
+              <w:t xml:space="preserve">24 tipe, tinggi total 0,75–5,03 m</w:t>
+            </w:r>
+          </w:p>
+        </w:tc>
+        <w:tc>
+          <w:tcPr>
+            <w:tcW w:type="dxa" w:w="3738"/>
+            <w:tcBorders>
+              <w:top w:val="single" w:color="808080" w:sz="4"/>
+              <w:left w:val="single" w:color="808080" w:sz="4"/>
+              <w:bottom w:val="single" w:color="808080" w:sz="4"/>
+              <w:right w:val="single" w:color="808080" w:sz="4"/>
+            </w:tcBorders>
+            <w:tcMar>
+              <w:top w:type="dxa" w:w="50"/>
+              <w:left w:type="dxa" w:w="90"/>
+              <w:bottom w:type="dxa" w:w="50"/>
+              <w:right w:type="dxa" w:w="90"/>
+            </w:tcMar>
+            <w:vAlign w:val="center"/>
+          </w:tcPr>
+          <w:p>
+            <w:pPr>
+              <w:spacing w:after="20"/>
+              <w:jc w:val="left"/>
+            </w:pPr>
+            <w:r>
+              <w:rPr>
+                <w:rFonts w:ascii="Arial" w:cs="Arial" w:eastAsia="Arial" w:hAnsi="Arial"/>
+                <w:sz w:val="18"/>
+                <w:szCs w:val="18"/>
+              </w:rPr>
+              <w:t xml:space="preserve">Volume pasangan = luas penampang detail (1:40) × panjang tiap tipe (A1-19)</w:t>
             </w:r>
           </w:p>
         </w:tc>
@@ -10672,161 +10470,97 @@
         </w:trPr>
         <w:tc>
           <w:tcPr>
-            <w:tcW w:type="dxa" w:w="1500"/>
-            <w:tcBorders>
-              <w:top w:val="single" w:color="808080" w:sz="4"/>
-              <w:left w:val="single" w:color="808080" w:sz="4"/>
-              <w:bottom w:val="single" w:color="808080" w:sz="4"/>
-              <w:right w:val="single" w:color="808080" w:sz="4"/>
-            </w:tcBorders>
-            <w:tcMar>
-              <w:top w:type="dxa" w:w="50"/>
-              <w:left w:type="dxa" w:w="90"/>
-              <w:bottom w:type="dxa" w:w="50"/>
-              <w:right w:type="dxa" w:w="90"/>
-            </w:tcMar>
-            <w:vAlign w:val="center"/>
-          </w:tcPr>
-          <w:p>
-            <w:pPr>
-              <w:spacing w:after="20"/>
-              <w:jc w:val="center"/>
-            </w:pPr>
-            <w:r>
-              <w:rPr>
-                <w:rFonts w:ascii="Arial" w:cs="Arial" w:eastAsia="Arial" w:hAnsi="Arial"/>
-                <w:sz w:val="18"/>
-                <w:szCs w:val="18"/>
-              </w:rPr>
-              <w:t xml:space="preserve">III</w:t>
-            </w:r>
-          </w:p>
-        </w:tc>
-        <w:tc>
-          <w:tcPr>
-            <w:tcW w:type="dxa" w:w="1900"/>
-            <w:tcBorders>
-              <w:top w:val="single" w:color="808080" w:sz="4"/>
-              <w:left w:val="single" w:color="808080" w:sz="4"/>
-              <w:bottom w:val="single" w:color="808080" w:sz="4"/>
-              <w:right w:val="single" w:color="808080" w:sz="4"/>
-            </w:tcBorders>
-            <w:tcMar>
-              <w:top w:type="dxa" w:w="50"/>
-              <w:left w:type="dxa" w:w="90"/>
-              <w:bottom w:type="dxa" w:w="50"/>
-              <w:right w:type="dxa" w:w="90"/>
-            </w:tcMar>
-            <w:vAlign w:val="center"/>
-          </w:tcPr>
-          <w:p>
-            <w:pPr>
-              <w:spacing w:after="20"/>
-              <w:jc w:val="center"/>
-            </w:pPr>
-            <w:r>
-              <w:rPr>
-                <w:rFonts w:ascii="Arial" w:cs="Arial" w:eastAsia="Arial" w:hAnsi="Arial"/>
-                <w:sz w:val="18"/>
-                <w:szCs w:val="18"/>
-              </w:rPr>
-              <w:t xml:space="preserve">[ ... ]</w:t>
-            </w:r>
-          </w:p>
-        </w:tc>
-        <w:tc>
-          <w:tcPr>
-            <w:tcW w:type="dxa" w:w="1900"/>
-            <w:tcBorders>
-              <w:top w:val="single" w:color="808080" w:sz="4"/>
-              <w:left w:val="single" w:color="808080" w:sz="4"/>
-              <w:bottom w:val="single" w:color="808080" w:sz="4"/>
-              <w:right w:val="single" w:color="808080" w:sz="4"/>
-            </w:tcBorders>
-            <w:tcMar>
-              <w:top w:type="dxa" w:w="50"/>
-              <w:left w:type="dxa" w:w="90"/>
-              <w:bottom w:type="dxa" w:w="50"/>
-              <w:right w:type="dxa" w:w="90"/>
-            </w:tcMar>
-            <w:vAlign w:val="center"/>
-          </w:tcPr>
-          <w:p>
-            <w:pPr>
-              <w:spacing w:after="20"/>
-              <w:jc w:val="center"/>
-            </w:pPr>
-            <w:r>
-              <w:rPr>
-                <w:rFonts w:ascii="Arial" w:cs="Arial" w:eastAsia="Arial" w:hAnsi="Arial"/>
-                <w:sz w:val="18"/>
-                <w:szCs w:val="18"/>
-              </w:rPr>
-              <w:t xml:space="preserve">[ ... ]</w:t>
-            </w:r>
-          </w:p>
-        </w:tc>
-        <w:tc>
-          <w:tcPr>
-            <w:tcW w:type="dxa" w:w="1900"/>
-            <w:tcBorders>
-              <w:top w:val="single" w:color="808080" w:sz="4"/>
-              <w:left w:val="single" w:color="808080" w:sz="4"/>
-              <w:bottom w:val="single" w:color="808080" w:sz="4"/>
-              <w:right w:val="single" w:color="808080" w:sz="4"/>
-            </w:tcBorders>
-            <w:tcMar>
-              <w:top w:type="dxa" w:w="50"/>
-              <w:left w:type="dxa" w:w="90"/>
-              <w:bottom w:type="dxa" w:w="50"/>
-              <w:right w:type="dxa" w:w="90"/>
-            </w:tcMar>
-            <w:vAlign w:val="center"/>
-          </w:tcPr>
-          <w:p>
-            <w:pPr>
-              <w:spacing w:after="20"/>
-              <w:jc w:val="center"/>
-            </w:pPr>
-            <w:r>
-              <w:rPr>
-                <w:rFonts w:ascii="Arial" w:cs="Arial" w:eastAsia="Arial" w:hAnsi="Arial"/>
-                <w:sz w:val="18"/>
-                <w:szCs w:val="18"/>
-              </w:rPr>
-              <w:t xml:space="preserve">[ ... ]</w:t>
-            </w:r>
-          </w:p>
-        </w:tc>
-        <w:tc>
-          <w:tcPr>
-            <w:tcW w:type="dxa" w:w="2438"/>
-            <w:tcBorders>
-              <w:top w:val="single" w:color="808080" w:sz="4"/>
-              <w:left w:val="single" w:color="808080" w:sz="4"/>
-              <w:bottom w:val="single" w:color="808080" w:sz="4"/>
-              <w:right w:val="single" w:color="808080" w:sz="4"/>
-            </w:tcBorders>
-            <w:tcMar>
-              <w:top w:type="dxa" w:w="50"/>
-              <w:left w:type="dxa" w:w="90"/>
-              <w:bottom w:type="dxa" w:w="50"/>
-              <w:right w:type="dxa" w:w="90"/>
-            </w:tcMar>
-            <w:vAlign w:val="center"/>
-          </w:tcPr>
-          <w:p>
-            <w:pPr>
-              <w:spacing w:after="20"/>
-              <w:jc w:val="left"/>
-            </w:pPr>
-            <w:r>
-              <w:rPr>
-                <w:rFonts w:ascii="Arial" w:cs="Arial" w:eastAsia="Arial" w:hAnsi="Arial"/>
-                <w:sz w:val="18"/>
-                <w:szCs w:val="18"/>
-              </w:rPr>
-              <w:t xml:space="preserve"/>
+            <w:tcW w:type="dxa" w:w="2000"/>
+            <w:tcBorders>
+              <w:top w:val="single" w:color="808080" w:sz="4"/>
+              <w:left w:val="single" w:color="808080" w:sz="4"/>
+              <w:bottom w:val="single" w:color="808080" w:sz="4"/>
+              <w:right w:val="single" w:color="808080" w:sz="4"/>
+            </w:tcBorders>
+            <w:tcMar>
+              <w:top w:type="dxa" w:w="50"/>
+              <w:left w:type="dxa" w:w="90"/>
+              <w:bottom w:type="dxa" w:w="50"/>
+              <w:right w:type="dxa" w:w="90"/>
+            </w:tcMar>
+            <w:vAlign w:val="center"/>
+          </w:tcPr>
+          <w:p>
+            <w:pPr>
+              <w:spacing w:after="20"/>
+              <w:jc w:val="left"/>
+            </w:pPr>
+            <w:r>
+              <w:rPr>
+                <w:rFonts w:ascii="Arial" w:cs="Arial" w:eastAsia="Arial" w:hAnsi="Arial"/>
+                <w:sz w:val="18"/>
+                <w:szCs w:val="18"/>
+              </w:rPr>
+              <w:t xml:space="preserve">Turap Segmen B</w:t>
+            </w:r>
+          </w:p>
+        </w:tc>
+        <w:tc>
+          <w:tcPr>
+            <w:tcW w:type="dxa" w:w="3900"/>
+            <w:tcBorders>
+              <w:top w:val="single" w:color="808080" w:sz="4"/>
+              <w:left w:val="single" w:color="808080" w:sz="4"/>
+              <w:bottom w:val="single" w:color="808080" w:sz="4"/>
+              <w:right w:val="single" w:color="808080" w:sz="4"/>
+            </w:tcBorders>
+            <w:tcMar>
+              <w:top w:type="dxa" w:w="50"/>
+              <w:left w:type="dxa" w:w="90"/>
+              <w:bottom w:type="dxa" w:w="50"/>
+              <w:right w:type="dxa" w:w="90"/>
+            </w:tcMar>
+            <w:vAlign w:val="center"/>
+          </w:tcPr>
+          <w:p>
+            <w:pPr>
+              <w:spacing w:after="20"/>
+              <w:jc w:val="left"/>
+            </w:pPr>
+            <w:r>
+              <w:rPr>
+                <w:rFonts w:ascii="Arial" w:cs="Arial" w:eastAsia="Arial" w:hAnsi="Arial"/>
+                <w:sz w:val="18"/>
+                <w:szCs w:val="18"/>
+              </w:rPr>
+              <w:t xml:space="preserve">28 tipe, tinggi total 0,75–7,33 m</w:t>
+            </w:r>
+          </w:p>
+        </w:tc>
+        <w:tc>
+          <w:tcPr>
+            <w:tcW w:type="dxa" w:w="3738"/>
+            <w:tcBorders>
+              <w:top w:val="single" w:color="808080" w:sz="4"/>
+              <w:left w:val="single" w:color="808080" w:sz="4"/>
+              <w:bottom w:val="single" w:color="808080" w:sz="4"/>
+              <w:right w:val="single" w:color="808080" w:sz="4"/>
+            </w:tcBorders>
+            <w:tcMar>
+              <w:top w:type="dxa" w:w="50"/>
+              <w:left w:type="dxa" w:w="90"/>
+              <w:bottom w:type="dxa" w:w="50"/>
+              <w:right w:type="dxa" w:w="90"/>
+            </w:tcMar>
+            <w:vAlign w:val="center"/>
+          </w:tcPr>
+          <w:p>
+            <w:pPr>
+              <w:spacing w:after="20"/>
+              <w:jc w:val="left"/>
+            </w:pPr>
+            <w:r>
+              <w:rPr>
+                <w:rFonts w:ascii="Arial" w:cs="Arial" w:eastAsia="Arial" w:hAnsi="Arial"/>
+                <w:sz w:val="18"/>
+                <w:szCs w:val="18"/>
+              </w:rPr>
+              <w:t xml:space="preserve">Idem, panjang tiap tipe dari A1-25</w:t>
             </w:r>
           </w:p>
         </w:tc>
@@ -10837,161 +10571,97 @@
         </w:trPr>
         <w:tc>
           <w:tcPr>
-            <w:tcW w:type="dxa" w:w="1500"/>
-            <w:tcBorders>
-              <w:top w:val="single" w:color="808080" w:sz="4"/>
-              <w:left w:val="single" w:color="808080" w:sz="4"/>
-              <w:bottom w:val="single" w:color="808080" w:sz="4"/>
-              <w:right w:val="single" w:color="808080" w:sz="4"/>
-            </w:tcBorders>
-            <w:tcMar>
-              <w:top w:type="dxa" w:w="50"/>
-              <w:left w:type="dxa" w:w="90"/>
-              <w:bottom w:type="dxa" w:w="50"/>
-              <w:right w:type="dxa" w:w="90"/>
-            </w:tcMar>
-            <w:vAlign w:val="center"/>
-          </w:tcPr>
-          <w:p>
-            <w:pPr>
-              <w:spacing w:after="20"/>
-              <w:jc w:val="center"/>
-            </w:pPr>
-            <w:r>
-              <w:rPr>
-                <w:rFonts w:ascii="Arial" w:cs="Arial" w:eastAsia="Arial" w:hAnsi="Arial"/>
-                <w:sz w:val="18"/>
-                <w:szCs w:val="18"/>
-              </w:rPr>
-              <w:t xml:space="preserve">IV</w:t>
-            </w:r>
-          </w:p>
-        </w:tc>
-        <w:tc>
-          <w:tcPr>
-            <w:tcW w:type="dxa" w:w="1900"/>
-            <w:tcBorders>
-              <w:top w:val="single" w:color="808080" w:sz="4"/>
-              <w:left w:val="single" w:color="808080" w:sz="4"/>
-              <w:bottom w:val="single" w:color="808080" w:sz="4"/>
-              <w:right w:val="single" w:color="808080" w:sz="4"/>
-            </w:tcBorders>
-            <w:tcMar>
-              <w:top w:type="dxa" w:w="50"/>
-              <w:left w:type="dxa" w:w="90"/>
-              <w:bottom w:type="dxa" w:w="50"/>
-              <w:right w:type="dxa" w:w="90"/>
-            </w:tcMar>
-            <w:vAlign w:val="center"/>
-          </w:tcPr>
-          <w:p>
-            <w:pPr>
-              <w:spacing w:after="20"/>
-              <w:jc w:val="center"/>
-            </w:pPr>
-            <w:r>
-              <w:rPr>
-                <w:rFonts w:ascii="Arial" w:cs="Arial" w:eastAsia="Arial" w:hAnsi="Arial"/>
-                <w:sz w:val="18"/>
-                <w:szCs w:val="18"/>
-              </w:rPr>
-              <w:t xml:space="preserve">[ ... ]</w:t>
-            </w:r>
-          </w:p>
-        </w:tc>
-        <w:tc>
-          <w:tcPr>
-            <w:tcW w:type="dxa" w:w="1900"/>
-            <w:tcBorders>
-              <w:top w:val="single" w:color="808080" w:sz="4"/>
-              <w:left w:val="single" w:color="808080" w:sz="4"/>
-              <w:bottom w:val="single" w:color="808080" w:sz="4"/>
-              <w:right w:val="single" w:color="808080" w:sz="4"/>
-            </w:tcBorders>
-            <w:tcMar>
-              <w:top w:type="dxa" w:w="50"/>
-              <w:left w:type="dxa" w:w="90"/>
-              <w:bottom w:type="dxa" w:w="50"/>
-              <w:right w:type="dxa" w:w="90"/>
-            </w:tcMar>
-            <w:vAlign w:val="center"/>
-          </w:tcPr>
-          <w:p>
-            <w:pPr>
-              <w:spacing w:after="20"/>
-              <w:jc w:val="center"/>
-            </w:pPr>
-            <w:r>
-              <w:rPr>
-                <w:rFonts w:ascii="Arial" w:cs="Arial" w:eastAsia="Arial" w:hAnsi="Arial"/>
-                <w:sz w:val="18"/>
-                <w:szCs w:val="18"/>
-              </w:rPr>
-              <w:t xml:space="preserve">[ ... ]</w:t>
-            </w:r>
-          </w:p>
-        </w:tc>
-        <w:tc>
-          <w:tcPr>
-            <w:tcW w:type="dxa" w:w="1900"/>
-            <w:tcBorders>
-              <w:top w:val="single" w:color="808080" w:sz="4"/>
-              <w:left w:val="single" w:color="808080" w:sz="4"/>
-              <w:bottom w:val="single" w:color="808080" w:sz="4"/>
-              <w:right w:val="single" w:color="808080" w:sz="4"/>
-            </w:tcBorders>
-            <w:tcMar>
-              <w:top w:type="dxa" w:w="50"/>
-              <w:left w:type="dxa" w:w="90"/>
-              <w:bottom w:type="dxa" w:w="50"/>
-              <w:right w:type="dxa" w:w="90"/>
-            </w:tcMar>
-            <w:vAlign w:val="center"/>
-          </w:tcPr>
-          <w:p>
-            <w:pPr>
-              <w:spacing w:after="20"/>
-              <w:jc w:val="center"/>
-            </w:pPr>
-            <w:r>
-              <w:rPr>
-                <w:rFonts w:ascii="Arial" w:cs="Arial" w:eastAsia="Arial" w:hAnsi="Arial"/>
-                <w:sz w:val="18"/>
-                <w:szCs w:val="18"/>
-              </w:rPr>
-              <w:t xml:space="preserve">[ ... ]</w:t>
-            </w:r>
-          </w:p>
-        </w:tc>
-        <w:tc>
-          <w:tcPr>
-            <w:tcW w:type="dxa" w:w="2438"/>
-            <w:tcBorders>
-              <w:top w:val="single" w:color="808080" w:sz="4"/>
-              <w:left w:val="single" w:color="808080" w:sz="4"/>
-              <w:bottom w:val="single" w:color="808080" w:sz="4"/>
-              <w:right w:val="single" w:color="808080" w:sz="4"/>
-            </w:tcBorders>
-            <w:tcMar>
-              <w:top w:type="dxa" w:w="50"/>
-              <w:left w:type="dxa" w:w="90"/>
-              <w:bottom w:type="dxa" w:w="50"/>
-              <w:right w:type="dxa" w:w="90"/>
-            </w:tcMar>
-            <w:vAlign w:val="center"/>
-          </w:tcPr>
-          <w:p>
-            <w:pPr>
-              <w:spacing w:after="20"/>
-              <w:jc w:val="left"/>
-            </w:pPr>
-            <w:r>
-              <w:rPr>
-                <w:rFonts w:ascii="Arial" w:cs="Arial" w:eastAsia="Arial" w:hAnsi="Arial"/>
-                <w:sz w:val="18"/>
-                <w:szCs w:val="18"/>
-              </w:rPr>
-              <w:t xml:space="preserve"/>
+            <w:tcW w:type="dxa" w:w="2000"/>
+            <w:tcBorders>
+              <w:top w:val="single" w:color="808080" w:sz="4"/>
+              <w:left w:val="single" w:color="808080" w:sz="4"/>
+              <w:bottom w:val="single" w:color="808080" w:sz="4"/>
+              <w:right w:val="single" w:color="808080" w:sz="4"/>
+            </w:tcBorders>
+            <w:tcMar>
+              <w:top w:type="dxa" w:w="50"/>
+              <w:left w:type="dxa" w:w="90"/>
+              <w:bottom w:type="dxa" w:w="50"/>
+              <w:right w:type="dxa" w:w="90"/>
+            </w:tcMar>
+            <w:vAlign w:val="center"/>
+          </w:tcPr>
+          <w:p>
+            <w:pPr>
+              <w:spacing w:after="20"/>
+              <w:jc w:val="left"/>
+            </w:pPr>
+            <w:r>
+              <w:rPr>
+                <w:rFonts w:ascii="Arial" w:cs="Arial" w:eastAsia="Arial" w:hAnsi="Arial"/>
+                <w:sz w:val="18"/>
+                <w:szCs w:val="18"/>
+              </w:rPr>
+              <w:t xml:space="preserve">Saluran D1</w:t>
+            </w:r>
+          </w:p>
+        </w:tc>
+        <w:tc>
+          <w:tcPr>
+            <w:tcW w:type="dxa" w:w="3900"/>
+            <w:tcBorders>
+              <w:top w:val="single" w:color="808080" w:sz="4"/>
+              <w:left w:val="single" w:color="808080" w:sz="4"/>
+              <w:bottom w:val="single" w:color="808080" w:sz="4"/>
+              <w:right w:val="single" w:color="808080" w:sz="4"/>
+            </w:tcBorders>
+            <w:tcMar>
+              <w:top w:type="dxa" w:w="50"/>
+              <w:left w:type="dxa" w:w="90"/>
+              <w:bottom w:type="dxa" w:w="50"/>
+              <w:right w:type="dxa" w:w="90"/>
+            </w:tcMar>
+            <w:vAlign w:val="center"/>
+          </w:tcPr>
+          <w:p>
+            <w:pPr>
+              <w:spacing w:after="20"/>
+              <w:jc w:val="left"/>
+            </w:pPr>
+            <w:r>
+              <w:rPr>
+                <w:rFonts w:ascii="Arial" w:cs="Arial" w:eastAsia="Arial" w:hAnsi="Arial"/>
+                <w:sz w:val="18"/>
+                <w:szCs w:val="18"/>
+              </w:rPr>
+              <w:t xml:space="preserve">U-ditch 100×100×10–120 + 2 gutter 30×50</w:t>
+            </w:r>
+          </w:p>
+        </w:tc>
+        <w:tc>
+          <w:tcPr>
+            <w:tcW w:type="dxa" w:w="3738"/>
+            <w:tcBorders>
+              <w:top w:val="single" w:color="808080" w:sz="4"/>
+              <w:left w:val="single" w:color="808080" w:sz="4"/>
+              <w:bottom w:val="single" w:color="808080" w:sz="4"/>
+              <w:right w:val="single" w:color="808080" w:sz="4"/>
+            </w:tcBorders>
+            <w:tcMar>
+              <w:top w:type="dxa" w:w="50"/>
+              <w:left w:type="dxa" w:w="90"/>
+              <w:bottom w:type="dxa" w:w="50"/>
+              <w:right w:type="dxa" w:w="90"/>
+            </w:tcMar>
+            <w:vAlign w:val="center"/>
+          </w:tcPr>
+          <w:p>
+            <w:pPr>
+              <w:spacing w:after="20"/>
+              <w:jc w:val="left"/>
+            </w:pPr>
+            <w:r>
+              <w:rPr>
+                <w:rFonts w:ascii="Arial" w:cs="Arial" w:eastAsia="Arial" w:hAnsi="Arial"/>
+                <w:sz w:val="18"/>
+                <w:szCs w:val="18"/>
+              </w:rPr>
+              <w:t xml:space="preserve">Panjang jalur dari A1-32 ÷ 1,20 m per elemen</w:t>
             </w:r>
           </w:p>
         </w:tc>
@@ -11002,161 +10672,299 @@
         </w:trPr>
         <w:tc>
           <w:tcPr>
-            <w:tcW w:type="dxa" w:w="1500"/>
-            <w:tcBorders>
-              <w:top w:val="single" w:color="808080" w:sz="4"/>
-              <w:left w:val="single" w:color="808080" w:sz="4"/>
-              <w:bottom w:val="single" w:color="808080" w:sz="4"/>
-              <w:right w:val="single" w:color="808080" w:sz="4"/>
-            </w:tcBorders>
-            <w:tcMar>
-              <w:top w:type="dxa" w:w="50"/>
-              <w:left w:type="dxa" w:w="90"/>
-              <w:bottom w:type="dxa" w:w="50"/>
-              <w:right w:type="dxa" w:w="90"/>
-            </w:tcMar>
-            <w:vAlign w:val="center"/>
-          </w:tcPr>
-          <w:p>
-            <w:pPr>
-              <w:spacing w:after="20"/>
-              <w:jc w:val="center"/>
-            </w:pPr>
-            <w:r>
-              <w:rPr>
-                <w:rFonts w:ascii="Arial" w:cs="Arial" w:eastAsia="Arial" w:hAnsi="Arial"/>
-                <w:sz w:val="18"/>
-                <w:szCs w:val="18"/>
-              </w:rPr>
-              <w:t xml:space="preserve">Total</w:t>
-            </w:r>
-          </w:p>
-        </w:tc>
-        <w:tc>
-          <w:tcPr>
-            <w:tcW w:type="dxa" w:w="1900"/>
-            <w:tcBorders>
-              <w:top w:val="single" w:color="808080" w:sz="4"/>
-              <w:left w:val="single" w:color="808080" w:sz="4"/>
-              <w:bottom w:val="single" w:color="808080" w:sz="4"/>
-              <w:right w:val="single" w:color="808080" w:sz="4"/>
-            </w:tcBorders>
-            <w:tcMar>
-              <w:top w:type="dxa" w:w="50"/>
-              <w:left w:type="dxa" w:w="90"/>
-              <w:bottom w:type="dxa" w:w="50"/>
-              <w:right w:type="dxa" w:w="90"/>
-            </w:tcMar>
-            <w:vAlign w:val="center"/>
-          </w:tcPr>
-          <w:p>
-            <w:pPr>
-              <w:spacing w:after="20"/>
-              <w:jc w:val="center"/>
-            </w:pPr>
-            <w:r>
-              <w:rPr>
-                <w:rFonts w:ascii="Arial" w:cs="Arial" w:eastAsia="Arial" w:hAnsi="Arial"/>
-                <w:sz w:val="18"/>
-                <w:szCs w:val="18"/>
-              </w:rPr>
-              <w:t xml:space="preserve">[ ... ]</w:t>
-            </w:r>
-          </w:p>
-        </w:tc>
-        <w:tc>
-          <w:tcPr>
-            <w:tcW w:type="dxa" w:w="1900"/>
-            <w:tcBorders>
-              <w:top w:val="single" w:color="808080" w:sz="4"/>
-              <w:left w:val="single" w:color="808080" w:sz="4"/>
-              <w:bottom w:val="single" w:color="808080" w:sz="4"/>
-              <w:right w:val="single" w:color="808080" w:sz="4"/>
-            </w:tcBorders>
-            <w:tcMar>
-              <w:top w:type="dxa" w:w="50"/>
-              <w:left w:type="dxa" w:w="90"/>
-              <w:bottom w:type="dxa" w:w="50"/>
-              <w:right w:type="dxa" w:w="90"/>
-            </w:tcMar>
-            <w:vAlign w:val="center"/>
-          </w:tcPr>
-          <w:p>
-            <w:pPr>
-              <w:spacing w:after="20"/>
-              <w:jc w:val="center"/>
-            </w:pPr>
-            <w:r>
-              <w:rPr>
-                <w:rFonts w:ascii="Arial" w:cs="Arial" w:eastAsia="Arial" w:hAnsi="Arial"/>
-                <w:sz w:val="18"/>
-                <w:szCs w:val="18"/>
-              </w:rPr>
-              <w:t xml:space="preserve">[ ... ]</w:t>
-            </w:r>
-          </w:p>
-        </w:tc>
-        <w:tc>
-          <w:tcPr>
-            <w:tcW w:type="dxa" w:w="1900"/>
-            <w:tcBorders>
-              <w:top w:val="single" w:color="808080" w:sz="4"/>
-              <w:left w:val="single" w:color="808080" w:sz="4"/>
-              <w:bottom w:val="single" w:color="808080" w:sz="4"/>
-              <w:right w:val="single" w:color="808080" w:sz="4"/>
-            </w:tcBorders>
-            <w:tcMar>
-              <w:top w:type="dxa" w:w="50"/>
-              <w:left w:type="dxa" w:w="90"/>
-              <w:bottom w:type="dxa" w:w="50"/>
-              <w:right w:type="dxa" w:w="90"/>
-            </w:tcMar>
-            <w:vAlign w:val="center"/>
-          </w:tcPr>
-          <w:p>
-            <w:pPr>
-              <w:spacing w:after="20"/>
-              <w:jc w:val="center"/>
-            </w:pPr>
-            <w:r>
-              <w:rPr>
-                <w:rFonts w:ascii="Arial" w:cs="Arial" w:eastAsia="Arial" w:hAnsi="Arial"/>
-                <w:sz w:val="18"/>
-                <w:szCs w:val="18"/>
-              </w:rPr>
-              <w:t xml:space="preserve">[ ... ]</w:t>
-            </w:r>
-          </w:p>
-        </w:tc>
-        <w:tc>
-          <w:tcPr>
-            <w:tcW w:type="dxa" w:w="2438"/>
-            <w:tcBorders>
-              <w:top w:val="single" w:color="808080" w:sz="4"/>
-              <w:left w:val="single" w:color="808080" w:sz="4"/>
-              <w:bottom w:val="single" w:color="808080" w:sz="4"/>
-              <w:right w:val="single" w:color="808080" w:sz="4"/>
-            </w:tcBorders>
-            <w:tcMar>
-              <w:top w:type="dxa" w:w="50"/>
-              <w:left w:type="dxa" w:w="90"/>
-              <w:bottom w:type="dxa" w:w="50"/>
-              <w:right w:type="dxa" w:w="90"/>
-            </w:tcMar>
-            <w:vAlign w:val="center"/>
-          </w:tcPr>
-          <w:p>
-            <w:pPr>
-              <w:spacing w:after="20"/>
-              <w:jc w:val="left"/>
-            </w:pPr>
-            <w:r>
-              <w:rPr>
-                <w:rFonts w:ascii="Arial" w:cs="Arial" w:eastAsia="Arial" w:hAnsi="Arial"/>
-                <w:sz w:val="18"/>
-                <w:szCs w:val="18"/>
-              </w:rPr>
-              <w:t xml:space="preserve">Kelebihan: buang; kekurangan: borrow</w:t>
+            <w:tcW w:type="dxa" w:w="2000"/>
+            <w:tcBorders>
+              <w:top w:val="single" w:color="808080" w:sz="4"/>
+              <w:left w:val="single" w:color="808080" w:sz="4"/>
+              <w:bottom w:val="single" w:color="808080" w:sz="4"/>
+              <w:right w:val="single" w:color="808080" w:sz="4"/>
+            </w:tcBorders>
+            <w:tcMar>
+              <w:top w:type="dxa" w:w="50"/>
+              <w:left w:type="dxa" w:w="90"/>
+              <w:bottom w:type="dxa" w:w="50"/>
+              <w:right w:type="dxa" w:w="90"/>
+            </w:tcMar>
+            <w:vAlign w:val="center"/>
+          </w:tcPr>
+          <w:p>
+            <w:pPr>
+              <w:spacing w:after="20"/>
+              <w:jc w:val="left"/>
+            </w:pPr>
+            <w:r>
+              <w:rPr>
+                <w:rFonts w:ascii="Arial" w:cs="Arial" w:eastAsia="Arial" w:hAnsi="Arial"/>
+                <w:sz w:val="18"/>
+                <w:szCs w:val="18"/>
+              </w:rPr>
+              <w:t xml:space="preserve">Jalan kawasan</w:t>
+            </w:r>
+          </w:p>
+        </w:tc>
+        <w:tc>
+          <w:tcPr>
+            <w:tcW w:type="dxa" w:w="3900"/>
+            <w:tcBorders>
+              <w:top w:val="single" w:color="808080" w:sz="4"/>
+              <w:left w:val="single" w:color="808080" w:sz="4"/>
+              <w:bottom w:val="single" w:color="808080" w:sz="4"/>
+              <w:right w:val="single" w:color="808080" w:sz="4"/>
+            </w:tcBorders>
+            <w:tcMar>
+              <w:top w:type="dxa" w:w="50"/>
+              <w:left w:type="dxa" w:w="90"/>
+              <w:bottom w:type="dxa" w:w="50"/>
+              <w:right w:type="dxa" w:w="90"/>
+            </w:tcMar>
+            <w:vAlign w:val="center"/>
+          </w:tcPr>
+          <w:p>
+            <w:pPr>
+              <w:spacing w:after="20"/>
+              <w:jc w:val="left"/>
+            </w:pPr>
+            <w:r>
+              <w:rPr>
+                <w:rFonts w:ascii="Arial" w:cs="Arial" w:eastAsia="Arial" w:hAnsi="Arial"/>
+                <w:sz w:val="18"/>
+                <w:szCs w:val="18"/>
+              </w:rPr>
+              <w:t xml:space="preserve">Badan jalan 6 m + trotoar 1,5 m ×2</w:t>
+            </w:r>
+          </w:p>
+        </w:tc>
+        <w:tc>
+          <w:tcPr>
+            <w:tcW w:type="dxa" w:w="3738"/>
+            <w:tcBorders>
+              <w:top w:val="single" w:color="808080" w:sz="4"/>
+              <w:left w:val="single" w:color="808080" w:sz="4"/>
+              <w:bottom w:val="single" w:color="808080" w:sz="4"/>
+              <w:right w:val="single" w:color="808080" w:sz="4"/>
+            </w:tcBorders>
+            <w:tcMar>
+              <w:top w:type="dxa" w:w="50"/>
+              <w:left w:type="dxa" w:w="90"/>
+              <w:bottom w:type="dxa" w:w="50"/>
+              <w:right w:type="dxa" w:w="90"/>
+            </w:tcMar>
+            <w:vAlign w:val="center"/>
+          </w:tcPr>
+          <w:p>
+            <w:pPr>
+              <w:spacing w:after="20"/>
+              <w:jc w:val="left"/>
+            </w:pPr>
+            <w:r>
+              <w:rPr>
+                <w:rFonts w:ascii="Arial" w:cs="Arial" w:eastAsia="Arial" w:hAnsi="Arial"/>
+                <w:sz w:val="18"/>
+                <w:szCs w:val="18"/>
+              </w:rPr>
+              <w:t xml:space="preserve">Panjang as jalan × lebar</w:t>
+            </w:r>
+          </w:p>
+        </w:tc>
+      </w:tr>
+      <w:tr>
+        <w:trPr>
+          <w:cantSplit/>
+        </w:trPr>
+        <w:tc>
+          <w:tcPr>
+            <w:tcW w:type="dxa" w:w="2000"/>
+            <w:tcBorders>
+              <w:top w:val="single" w:color="808080" w:sz="4"/>
+              <w:left w:val="single" w:color="808080" w:sz="4"/>
+              <w:bottom w:val="single" w:color="808080" w:sz="4"/>
+              <w:right w:val="single" w:color="808080" w:sz="4"/>
+            </w:tcBorders>
+            <w:tcMar>
+              <w:top w:type="dxa" w:w="50"/>
+              <w:left w:type="dxa" w:w="90"/>
+              <w:bottom w:type="dxa" w:w="50"/>
+              <w:right w:type="dxa" w:w="90"/>
+            </w:tcMar>
+            <w:vAlign w:val="center"/>
+          </w:tcPr>
+          <w:p>
+            <w:pPr>
+              <w:spacing w:after="20"/>
+              <w:jc w:val="left"/>
+            </w:pPr>
+            <w:r>
+              <w:rPr>
+                <w:rFonts w:ascii="Arial" w:cs="Arial" w:eastAsia="Arial" w:hAnsi="Arial"/>
+                <w:sz w:val="18"/>
+                <w:szCs w:val="18"/>
+              </w:rPr>
+              <w:t xml:space="preserve">Gedung Kantor</w:t>
+            </w:r>
+          </w:p>
+        </w:tc>
+        <w:tc>
+          <w:tcPr>
+            <w:tcW w:type="dxa" w:w="3900"/>
+            <w:tcBorders>
+              <w:top w:val="single" w:color="808080" w:sz="4"/>
+              <w:left w:val="single" w:color="808080" w:sz="4"/>
+              <w:bottom w:val="single" w:color="808080" w:sz="4"/>
+              <w:right w:val="single" w:color="808080" w:sz="4"/>
+            </w:tcBorders>
+            <w:tcMar>
+              <w:top w:type="dxa" w:w="50"/>
+              <w:left w:type="dxa" w:w="90"/>
+              <w:bottom w:type="dxa" w:w="50"/>
+              <w:right w:type="dxa" w:w="90"/>
+            </w:tcMar>
+            <w:vAlign w:val="center"/>
+          </w:tcPr>
+          <w:p>
+            <w:pPr>
+              <w:spacing w:after="20"/>
+              <w:jc w:val="left"/>
+            </w:pPr>
+            <w:r>
+              <w:rPr>
+                <w:rFonts w:ascii="Arial" w:cs="Arial" w:eastAsia="Arial" w:hAnsi="Arial"/>
+                <w:sz w:val="18"/>
+                <w:szCs w:val="18"/>
+              </w:rPr>
+              <w:t xml:space="preserve">Luas lantai dasar ±566 m²; 2 lantai ±1.100 m² (perkiraan)</w:t>
+            </w:r>
+          </w:p>
+        </w:tc>
+        <w:tc>
+          <w:tcPr>
+            <w:tcW w:type="dxa" w:w="3738"/>
+            <w:tcBorders>
+              <w:top w:val="single" w:color="808080" w:sz="4"/>
+              <w:left w:val="single" w:color="808080" w:sz="4"/>
+              <w:bottom w:val="single" w:color="808080" w:sz="4"/>
+              <w:right w:val="single" w:color="808080" w:sz="4"/>
+            </w:tcBorders>
+            <w:tcMar>
+              <w:top w:type="dxa" w:w="50"/>
+              <w:left w:type="dxa" w:w="90"/>
+              <w:bottom w:type="dxa" w:w="50"/>
+              <w:right w:type="dxa" w:w="90"/>
+            </w:tcMar>
+            <w:vAlign w:val="center"/>
+          </w:tcPr>
+          <w:p>
+            <w:pPr>
+              <w:spacing w:after="20"/>
+              <w:jc w:val="left"/>
+            </w:pPr>
+            <w:r>
+              <w:rPr>
+                <w:rFonts w:ascii="Arial" w:cs="Arial" w:eastAsia="Arial" w:hAnsi="Arial"/>
+                <w:sz w:val="18"/>
+                <w:szCs w:val="18"/>
+              </w:rPr>
+              <w:t xml:space="preserve">Per elemen struktur dari gambar STR</w:t>
+            </w:r>
+          </w:p>
+        </w:tc>
+      </w:tr>
+      <w:tr>
+        <w:trPr>
+          <w:cantSplit/>
+        </w:trPr>
+        <w:tc>
+          <w:tcPr>
+            <w:tcW w:type="dxa" w:w="2000"/>
+            <w:tcBorders>
+              <w:top w:val="single" w:color="808080" w:sz="4"/>
+              <w:left w:val="single" w:color="808080" w:sz="4"/>
+              <w:bottom w:val="single" w:color="808080" w:sz="4"/>
+              <w:right w:val="single" w:color="808080" w:sz="4"/>
+            </w:tcBorders>
+            <w:tcMar>
+              <w:top w:type="dxa" w:w="50"/>
+              <w:left w:type="dxa" w:w="90"/>
+              <w:bottom w:type="dxa" w:w="50"/>
+              <w:right w:type="dxa" w:w="90"/>
+            </w:tcMar>
+            <w:vAlign w:val="center"/>
+          </w:tcPr>
+          <w:p>
+            <w:pPr>
+              <w:spacing w:after="20"/>
+              <w:jc w:val="left"/>
+            </w:pPr>
+            <w:r>
+              <w:rPr>
+                <w:rFonts w:ascii="Arial" w:cs="Arial" w:eastAsia="Arial" w:hAnsi="Arial"/>
+                <w:sz w:val="18"/>
+                <w:szCs w:val="18"/>
+              </w:rPr>
+              <w:t xml:space="preserve">Paving halaman</w:t>
+            </w:r>
+          </w:p>
+        </w:tc>
+        <w:tc>
+          <w:tcPr>
+            <w:tcW w:type="dxa" w:w="3900"/>
+            <w:tcBorders>
+              <w:top w:val="single" w:color="808080" w:sz="4"/>
+              <w:left w:val="single" w:color="808080" w:sz="4"/>
+              <w:bottom w:val="single" w:color="808080" w:sz="4"/>
+              <w:right w:val="single" w:color="808080" w:sz="4"/>
+            </w:tcBorders>
+            <w:tcMar>
+              <w:top w:type="dxa" w:w="50"/>
+              <w:left w:type="dxa" w:w="90"/>
+              <w:bottom w:type="dxa" w:w="50"/>
+              <w:right w:type="dxa" w:w="90"/>
+            </w:tcMar>
+            <w:vAlign w:val="center"/>
+          </w:tcPr>
+          <w:p>
+            <w:pPr>
+              <w:spacing w:after="20"/>
+              <w:jc w:val="left"/>
+            </w:pPr>
+            <w:r>
+              <w:rPr>
+                <w:rFonts w:ascii="Arial" w:cs="Arial" w:eastAsia="Arial" w:hAnsi="Arial"/>
+                <w:sz w:val="18"/>
+                <w:szCs w:val="18"/>
+              </w:rPr>
+              <w:t xml:space="preserve">Area depan dan belakang kantor (A0-03)</w:t>
+            </w:r>
+          </w:p>
+        </w:tc>
+        <w:tc>
+          <w:tcPr>
+            <w:tcW w:type="dxa" w:w="3738"/>
+            <w:tcBorders>
+              <w:top w:val="single" w:color="808080" w:sz="4"/>
+              <w:left w:val="single" w:color="808080" w:sz="4"/>
+              <w:bottom w:val="single" w:color="808080" w:sz="4"/>
+              <w:right w:val="single" w:color="808080" w:sz="4"/>
+            </w:tcBorders>
+            <w:tcMar>
+              <w:top w:type="dxa" w:w="50"/>
+              <w:left w:type="dxa" w:w="90"/>
+              <w:bottom w:type="dxa" w:w="50"/>
+              <w:right w:type="dxa" w:w="90"/>
+            </w:tcMar>
+            <w:vAlign w:val="center"/>
+          </w:tcPr>
+          <w:p>
+            <w:pPr>
+              <w:spacing w:after="20"/>
+              <w:jc w:val="left"/>
+            </w:pPr>
+            <w:r>
+              <w:rPr>
+                <w:rFonts w:ascii="Arial" w:cs="Arial" w:eastAsia="Arial" w:hAnsi="Arial"/>
+                <w:sz w:val="18"/>
+                <w:szCs w:val="18"/>
+              </w:rPr>
+              <w:t xml:space="preserve">Luas dari dimensi A0-03</w:t>
             </w:r>
           </w:p>
         </w:tc>
@@ -11175,7 +10983,7 @@
           <w:sz w:val="19"/>
           <w:szCs w:val="19"/>
         </w:rPr>
-        <w:t xml:space="preserve">Catatan: volume belum dapat dihitung dari berkas karena skala dan grafik cross-section tidak terbaca presisi; dihitung ulang dari data pengukuran lapangan.</w:t>
+        <w:t xml:space="preserve">Volume galian-timbunan, panjang turap dan panjang saluran dihitung Kontraktor dari survei topografi awal pada tahap mobilisasi (Bab 4.2); angka pada gambar belum cukup terbaca untuk dijumlahkan secara akurat. Selisih galian-timbunan dikelola sebagai disposal atau borrow sesuai persetujuan MK.</w:t>
       </w:r>
     </w:p>
     <w:p>
@@ -22102,7 +21910,7 @@
           <w:sz w:val="21"/>
           <w:szCs w:val="21"/>
         </w:rPr>
-        <w:t xml:space="preserve">[ Nama ]</w:t>
+        <w:t xml:space="preserve">Project Manager</w:t>
       </w:r>
       <w:r>
         <w:rPr>
@@ -22110,7 +21918,7 @@
           <w:sz w:val="21"/>
           <w:szCs w:val="21"/>
         </w:rPr>
-        <w:t xml:space="preserve">  –  Project Manager Kontraktor Pelaksana</w:t>
+        <w:t xml:space="preserve">  –  Kontraktor Pelaksana</w:t>
       </w:r>
     </w:p>
     <w:p>

</xml_diff>